<commit_message>
Informe: agrega enlace del repositorio y cifras finales de la toma
</commit_message>
<xml_diff>
--- a/informe/Laboratorio 5 - Informe.docx
+++ b/informe/Laboratorio 5 - Informe.docx
@@ -44,6 +44,20 @@
           <w:szCs w:val="19"/>
         </w:rPr>
         <w:t xml:space="preserve">Dawer Stiven Patiño · Julian Mejia · Santiago Jacome</w:t>
+      </w:r>
+    </w:p>
+    <w:p>
+      <w:pPr>
+        <w:spacing w:after="140"/>
+        <w:jc w:val="center"/>
+      </w:pPr>
+      <w:r>
+        <w:rPr>
+          <w:color w:val="1D4ED8"/>
+          <w:sz w:val="19"/>
+          <w:szCs w:val="19"/>
+        </w:rPr>
+        <w:t xml:space="preserve">Repositorio: https://github.com/SantiagoJacome14/lab5-plataforma-iot</w:t>
       </w:r>
     </w:p>
     <w:p>
@@ -986,7 +1000,7 @@
           <w:sz w:val="20"/>
           <w:szCs w:val="20"/>
         </w:rPr>
-        <w:t xml:space="preserve">Repositorio: docker-compose.yml, publisher/, telegraf/, grafana/ (datasource, dashboard y alerta provisionados), README (cómo levantar el stack en una VM Linux o con Docker Desktop, sin secretos; .env.example), scripts/ (resumen_ventana.sh para Linux; iniciar, forzar_alerta y resumen_ventana en PowerShell para Windows) y /evidencias (01 compose ps, 02 mosquitto_sub, 03 consulta a InfluxDB, 04 dashboard, 05 alerta Pending/Firing, 06 log del webhook, 07 resumen de la ventana e inicio_toma.txt). La clave SSH y el .env no se entregan.</w:t>
+        <w:t xml:space="preserve">Repositorio en GitHub (https://github.com/SantiagoJacome14/lab5-plataforma-iot): docker-compose.yml, publisher/, telegraf/, grafana/ (datasource, dashboard y alerta provisionados), README (cómo levantar el stack en una VM Linux o con Docker Desktop, sin secretos; .env.example), scripts/ (resumen_ventana.sh para Linux; iniciar, forzar_alerta y resumen_ventana en PowerShell para Windows) y /evidencias (01 compose ps, 02 mosquitto_sub, 03 consulta a InfluxDB, 04 dashboard, 05 alerta Pending/Firing, 06 log del webhook, 07 resumen de la ventana e inicio_toma.txt). La clave SSH y el .env no se entregan.</w:t>
       </w:r>
     </w:p>
     <w:sectPr>

</xml_diff>

<commit_message>
Informe: agrega anexo de evidencias (capturas dentro del PDF)
</commit_message>
<xml_diff>
--- a/informe/Laboratorio 5 - Informe.docx
+++ b/informe/Laboratorio 5 - Informe.docx
@@ -1000,7 +1000,1118 @@
           <w:sz w:val="20"/>
           <w:szCs w:val="20"/>
         </w:rPr>
-        <w:t xml:space="preserve">Repositorio en GitHub (https://github.com/SantiagoJacome14/lab5-plataforma-iot): docker-compose.yml, publisher/, telegraf/, grafana/ (datasource, dashboard y alerta provisionados), README (cómo levantar el stack en una VM Linux o con Docker Desktop, sin secretos; .env.example), scripts/ (resumen_ventana.sh para Linux; iniciar, forzar_alerta y resumen_ventana en PowerShell para Windows) y /evidencias (01 compose ps, 02 mosquitto_sub, 03 consulta a InfluxDB, 04 dashboard, 05 alerta Pending/Firing, 06 log del webhook, 07 resumen de la ventana e inicio_toma.txt). La clave SSH y el .env no se entregan.</w:t>
+        <w:t xml:space="preserve">Repositorio en GitHub (https://github.com/SantiagoJacome14/lab5-plataforma-iot): docker-compose.yml, publisher/, telegraf/, grafana/ (datasource, dashboard y alerta provisionados), README (cómo levantar el stack en una VM Linux o con Docker Desktop, sin secretos; .env.example), scripts/ (resumen_ventana.sh para Linux; iniciar, forzar_alerta y resumen_ventana en PowerShell para Windows) y /evidencias (01 compose ps, 02 mosquitto_sub, 03 consulta a InfluxDB, 04 dashboard, 05 alerta Pending/Firing, 06 log del webhook, 07 resumen de la ventana e inicio_toma.txt). Las evidencias se adjuntan al final como Anexo. La clave SSH y el .env no se entregan.</w:t>
+      </w:r>
+    </w:p>
+    <w:p>
+      <w:r>
+        <w:br w:type="page"/>
+      </w:r>
+    </w:p>
+    <w:p>
+      <w:pPr>
+        <w:pStyle w:val="Heading1"/>
+        <w:spacing w:after="90" w:before="200"/>
+      </w:pPr>
+      <w:r>
+        <w:rPr>
+          <w:b/>
+          <w:bCs/>
+          <w:color w:val="B7862A"/>
+          <w:sz w:val="26"/>
+          <w:szCs w:val="26"/>
+        </w:rPr>
+        <w:t xml:space="preserve">Anexo — Evidencias</w:t>
+      </w:r>
+    </w:p>
+    <w:p>
+      <w:pPr>
+        <w:spacing w:after="100"/>
+      </w:pPr>
+      <w:r>
+        <w:rPr>
+          <w:sz w:val="20"/>
+          <w:szCs w:val="20"/>
+        </w:rPr>
+        <w:t xml:space="preserve">Capturas y archivos generados durante la toma real (17 al 21 de octubre de 2026, VM de Azure). Los mismos archivos están en la carpeta evidencias/ del repositorio.</w:t>
+      </w:r>
+    </w:p>
+    <w:p>
+      <w:pPr>
+        <w:keepNext/>
+        <w:spacing w:after="40" w:before="120"/>
+        <w:jc w:val="center"/>
+      </w:pPr>
+      <w:r>
+        <w:drawing>
+          <wp:inline distT="0" distB="0" distL="0" distR="0">
+            <wp:extent cx="5848350" cy="1285875"/>
+            <wp:effectExtent t="0" r="0" b="0" l="0"/>
+            <wp:docPr id="1" name="" descr="" title=""/>
+            <wp:cNvGraphicFramePr>
+              <a:graphicFrameLocks xmlns:a="http://schemas.openxmlformats.org/drawingml/2006/main" noChangeAspect="1"/>
+            </wp:cNvGraphicFramePr>
+            <a:graphic xmlns:a="http://schemas.openxmlformats.org/drawingml/2006/main">
+              <a:graphicData uri="http://schemas.openxmlformats.org/drawingml/2006/picture">
+                <pic:pic xmlns:pic="http://schemas.openxmlformats.org/drawingml/2006/picture">
+                  <pic:nvPicPr>
+                    <pic:cNvPr id="0" name="" descr=""/>
+                    <pic:cNvPicPr>
+                      <a:picLocks noChangeAspect="1" noChangeArrowheads="1"/>
+                    </pic:cNvPicPr>
+                  </pic:nvPicPr>
+                  <pic:blipFill>
+                    <a:blip r:embed="rId8" cstate="none"/>
+                    <a:srcRect/>
+                    <a:stretch>
+                      <a:fillRect/>
+                    </a:stretch>
+                  </pic:blipFill>
+                  <pic:spPr bwMode="auto">
+                    <a:xfrm>
+                      <a:off x="0" y="0"/>
+                      <a:ext cx="5848350" cy="1285875"/>
+                    </a:xfrm>
+                    <a:prstGeom prst="rect">
+                      <a:avLst/>
+                    </a:prstGeom>
+                  </pic:spPr>
+                </pic:pic>
+              </a:graphicData>
+            </a:graphic>
+          </wp:inline>
+        </w:drawing>
+      </w:r>
+    </w:p>
+    <w:p>
+      <w:pPr>
+        <w:spacing w:after="140"/>
+        <w:jc w:val="center"/>
+      </w:pPr>
+      <w:r>
+        <w:rPr>
+          <w:i/>
+          <w:iCs/>
+          <w:color w:val="475569"/>
+          <w:sz w:val="17"/>
+          <w:szCs w:val="17"/>
+        </w:rPr>
+        <w:t xml:space="preserve">Evidencia 01. docker compose ps: los 6 servicios arriba; influxdb en estado healthy.</w:t>
+      </w:r>
+    </w:p>
+    <w:p>
+      <w:pPr>
+        <w:keepNext/>
+        <w:spacing w:after="40" w:before="120"/>
+        <w:jc w:val="center"/>
+      </w:pPr>
+      <w:r>
+        <w:drawing>
+          <wp:inline distT="0" distB="0" distL="0" distR="0">
+            <wp:extent cx="5848350" cy="342900"/>
+            <wp:effectExtent t="0" r="0" b="0" l="0"/>
+            <wp:docPr id="1" name="" descr="" title=""/>
+            <wp:cNvGraphicFramePr>
+              <a:graphicFrameLocks xmlns:a="http://schemas.openxmlformats.org/drawingml/2006/main" noChangeAspect="1"/>
+            </wp:cNvGraphicFramePr>
+            <a:graphic xmlns:a="http://schemas.openxmlformats.org/drawingml/2006/main">
+              <a:graphicData uri="http://schemas.openxmlformats.org/drawingml/2006/picture">
+                <pic:pic xmlns:pic="http://schemas.openxmlformats.org/drawingml/2006/picture">
+                  <pic:nvPicPr>
+                    <pic:cNvPr id="0" name="" descr=""/>
+                    <pic:cNvPicPr>
+                      <a:picLocks noChangeAspect="1" noChangeArrowheads="1"/>
+                    </pic:cNvPicPr>
+                  </pic:nvPicPr>
+                  <pic:blipFill>
+                    <a:blip r:embed="rId9" cstate="none"/>
+                    <a:srcRect/>
+                    <a:stretch>
+                      <a:fillRect/>
+                    </a:stretch>
+                  </pic:blipFill>
+                  <pic:spPr bwMode="auto">
+                    <a:xfrm>
+                      <a:off x="0" y="0"/>
+                      <a:ext cx="5848350" cy="342900"/>
+                    </a:xfrm>
+                    <a:prstGeom prst="rect">
+                      <a:avLst/>
+                    </a:prstGeom>
+                  </pic:spPr>
+                </pic:pic>
+              </a:graphicData>
+            </a:graphic>
+          </wp:inline>
+        </w:drawing>
+      </w:r>
+    </w:p>
+    <w:p>
+      <w:pPr>
+        <w:spacing w:after="140"/>
+        <w:jc w:val="center"/>
+      </w:pPr>
+      <w:r>
+        <w:rPr>
+          <w:i/>
+          <w:iCs/>
+          <w:color w:val="475569"/>
+          <w:sz w:val="17"/>
+          <w:szCs w:val="17"/>
+        </w:rPr>
+        <w:t xml:space="preserve">Evidencia 02. Mensajes MQTT reales en el broker, topic lab5/vm-pub-01/telemetry (temperature, humidity, illuminance y ts en ms).</w:t>
+      </w:r>
+    </w:p>
+    <w:p>
+      <w:pPr>
+        <w:keepNext/>
+        <w:spacing w:after="40" w:before="120"/>
+        <w:jc w:val="center"/>
+      </w:pPr>
+      <w:r>
+        <w:drawing>
+          <wp:inline distT="0" distB="0" distL="0" distR="0">
+            <wp:extent cx="5848350" cy="2028825"/>
+            <wp:effectExtent t="0" r="0" b="0" l="0"/>
+            <wp:docPr id="1" name="" descr="" title=""/>
+            <wp:cNvGraphicFramePr>
+              <a:graphicFrameLocks xmlns:a="http://schemas.openxmlformats.org/drawingml/2006/main" noChangeAspect="1"/>
+            </wp:cNvGraphicFramePr>
+            <a:graphic xmlns:a="http://schemas.openxmlformats.org/drawingml/2006/main">
+              <a:graphicData uri="http://schemas.openxmlformats.org/drawingml/2006/picture">
+                <pic:pic xmlns:pic="http://schemas.openxmlformats.org/drawingml/2006/picture">
+                  <pic:nvPicPr>
+                    <pic:cNvPr id="0" name="" descr=""/>
+                    <pic:cNvPicPr>
+                      <a:picLocks noChangeAspect="1" noChangeArrowheads="1"/>
+                    </pic:cNvPicPr>
+                  </pic:nvPicPr>
+                  <pic:blipFill>
+                    <a:blip r:embed="rId10" cstate="none"/>
+                    <a:srcRect/>
+                    <a:stretch>
+                      <a:fillRect/>
+                    </a:stretch>
+                  </pic:blipFill>
+                  <pic:spPr bwMode="auto">
+                    <a:xfrm>
+                      <a:off x="0" y="0"/>
+                      <a:ext cx="5848350" cy="2028825"/>
+                    </a:xfrm>
+                    <a:prstGeom prst="rect">
+                      <a:avLst/>
+                    </a:prstGeom>
+                  </pic:spPr>
+                </pic:pic>
+              </a:graphicData>
+            </a:graphic>
+          </wp:inline>
+        </w:drawing>
+      </w:r>
+    </w:p>
+    <w:p>
+      <w:pPr>
+        <w:spacing w:after="140"/>
+        <w:jc w:val="center"/>
+      </w:pPr>
+      <w:r>
+        <w:rPr>
+          <w:i/>
+          <w:iCs/>
+          <w:color w:val="475569"/>
+          <w:sz w:val="17"/>
+          <w:szCs w:val="17"/>
+        </w:rPr>
+        <w:t xml:space="preserve">Evidencia 03. Consulta Flux a InfluxDB: último valor de cada variable, con device_id y la hora del publicador.</w:t>
+      </w:r>
+    </w:p>
+    <w:p>
+      <w:pPr>
+        <w:keepNext/>
+        <w:spacing w:after="40" w:before="120"/>
+        <w:jc w:val="center"/>
+      </w:pPr>
+      <w:r>
+        <w:drawing>
+          <wp:inline distT="0" distB="0" distL="0" distR="0">
+            <wp:extent cx="5848350" cy="3181350"/>
+            <wp:effectExtent t="0" r="0" b="0" l="0"/>
+            <wp:docPr id="1" name="" descr="" title=""/>
+            <wp:cNvGraphicFramePr>
+              <a:graphicFrameLocks xmlns:a="http://schemas.openxmlformats.org/drawingml/2006/main" noChangeAspect="1"/>
+            </wp:cNvGraphicFramePr>
+            <a:graphic xmlns:a="http://schemas.openxmlformats.org/drawingml/2006/main">
+              <a:graphicData uri="http://schemas.openxmlformats.org/drawingml/2006/picture">
+                <pic:pic xmlns:pic="http://schemas.openxmlformats.org/drawingml/2006/picture">
+                  <pic:nvPicPr>
+                    <pic:cNvPr id="0" name="" descr=""/>
+                    <pic:cNvPicPr>
+                      <a:picLocks noChangeAspect="1" noChangeArrowheads="1"/>
+                    </pic:cNvPicPr>
+                  </pic:nvPicPr>
+                  <pic:blipFill>
+                    <a:blip r:embed="rId11" cstate="none"/>
+                    <a:srcRect/>
+                    <a:stretch>
+                      <a:fillRect/>
+                    </a:stretch>
+                  </pic:blipFill>
+                  <pic:spPr bwMode="auto">
+                    <a:xfrm>
+                      <a:off x="0" y="0"/>
+                      <a:ext cx="5848350" cy="3181350"/>
+                    </a:xfrm>
+                    <a:prstGeom prst="rect">
+                      <a:avLst/>
+                    </a:prstGeom>
+                  </pic:spPr>
+                </pic:pic>
+              </a:graphicData>
+            </a:graphic>
+          </wp:inline>
+        </w:drawing>
+      </w:r>
+    </w:p>
+    <w:p>
+      <w:pPr>
+        <w:spacing w:after="140"/>
+        <w:jc w:val="center"/>
+      </w:pPr>
+      <w:r>
+        <w:rPr>
+          <w:i/>
+          <w:iCs/>
+          <w:color w:val="475569"/>
+          <w:sz w:val="17"/>
+          <w:szCs w:val="17"/>
+        </w:rPr>
+        <w:t xml:space="preserve">Evidencia 04. Dashboard con rango "Last 4 days" (parte superior): valores actuales, estado de la alerta y series de temperatura y humedad.</w:t>
+      </w:r>
+    </w:p>
+    <w:p>
+      <w:pPr>
+        <w:keepNext/>
+        <w:spacing w:after="40" w:before="120"/>
+        <w:jc w:val="center"/>
+      </w:pPr>
+      <w:r>
+        <w:drawing>
+          <wp:inline distT="0" distB="0" distL="0" distR="0">
+            <wp:extent cx="5848350" cy="2962275"/>
+            <wp:effectExtent t="0" r="0" b="0" l="0"/>
+            <wp:docPr id="1" name="" descr="" title=""/>
+            <wp:cNvGraphicFramePr>
+              <a:graphicFrameLocks xmlns:a="http://schemas.openxmlformats.org/drawingml/2006/main" noChangeAspect="1"/>
+            </wp:cNvGraphicFramePr>
+            <a:graphic xmlns:a="http://schemas.openxmlformats.org/drawingml/2006/main">
+              <a:graphicData uri="http://schemas.openxmlformats.org/drawingml/2006/picture">
+                <pic:pic xmlns:pic="http://schemas.openxmlformats.org/drawingml/2006/picture">
+                  <pic:nvPicPr>
+                    <pic:cNvPr id="0" name="" descr=""/>
+                    <pic:cNvPicPr>
+                      <a:picLocks noChangeAspect="1" noChangeArrowheads="1"/>
+                    </pic:cNvPicPr>
+                  </pic:nvPicPr>
+                  <pic:blipFill>
+                    <a:blip r:embed="rId12" cstate="none"/>
+                    <a:srcRect/>
+                    <a:stretch>
+                      <a:fillRect/>
+                    </a:stretch>
+                  </pic:blipFill>
+                  <pic:spPr bwMode="auto">
+                    <a:xfrm>
+                      <a:off x="0" y="0"/>
+                      <a:ext cx="5848350" cy="2962275"/>
+                    </a:xfrm>
+                    <a:prstGeom prst="rect">
+                      <a:avLst/>
+                    </a:prstGeom>
+                  </pic:spPr>
+                </pic:pic>
+              </a:graphicData>
+            </a:graphic>
+          </wp:inline>
+        </w:drawing>
+      </w:r>
+    </w:p>
+    <w:p>
+      <w:pPr>
+        <w:spacing w:after="140"/>
+        <w:jc w:val="center"/>
+      </w:pPr>
+      <w:r>
+        <w:rPr>
+          <w:i/>
+          <w:iCs/>
+          <w:color w:val="475569"/>
+          <w:sz w:val="17"/>
+          <w:szCs w:val="17"/>
+        </w:rPr>
+        <w:t xml:space="preserve">Evidencia 04b. Dashboard (parte inferior): iluminancia y mensajes por hora, estables en ~360, sin huecos.</w:t>
+      </w:r>
+    </w:p>
+    <w:p>
+      <w:pPr>
+        <w:keepNext/>
+        <w:spacing w:after="40" w:before="120"/>
+        <w:jc w:val="center"/>
+      </w:pPr>
+      <w:r>
+        <w:drawing>
+          <wp:inline distT="0" distB="0" distL="0" distR="0">
+            <wp:extent cx="5848350" cy="2762250"/>
+            <wp:effectExtent t="0" r="0" b="0" l="0"/>
+            <wp:docPr id="1" name="" descr="" title=""/>
+            <wp:cNvGraphicFramePr>
+              <a:graphicFrameLocks xmlns:a="http://schemas.openxmlformats.org/drawingml/2006/main" noChangeAspect="1"/>
+            </wp:cNvGraphicFramePr>
+            <a:graphic xmlns:a="http://schemas.openxmlformats.org/drawingml/2006/main">
+              <a:graphicData uri="http://schemas.openxmlformats.org/drawingml/2006/picture">
+                <pic:pic xmlns:pic="http://schemas.openxmlformats.org/drawingml/2006/picture">
+                  <pic:nvPicPr>
+                    <pic:cNvPr id="0" name="" descr=""/>
+                    <pic:cNvPicPr>
+                      <a:picLocks noChangeAspect="1" noChangeArrowheads="1"/>
+                    </pic:cNvPicPr>
+                  </pic:nvPicPr>
+                  <pic:blipFill>
+                    <a:blip r:embed="rId13" cstate="none"/>
+                    <a:srcRect/>
+                    <a:stretch>
+                      <a:fillRect/>
+                    </a:stretch>
+                  </pic:blipFill>
+                  <pic:spPr bwMode="auto">
+                    <a:xfrm>
+                      <a:off x="0" y="0"/>
+                      <a:ext cx="5848350" cy="2762250"/>
+                    </a:xfrm>
+                    <a:prstGeom prst="rect">
+                      <a:avLst/>
+                    </a:prstGeom>
+                  </pic:spPr>
+                </pic:pic>
+              </a:graphicData>
+            </a:graphic>
+          </wp:inline>
+        </w:drawing>
+      </w:r>
+    </w:p>
+    <w:p>
+      <w:pPr>
+        <w:spacing w:after="140"/>
+        <w:jc w:val="center"/>
+      </w:pPr>
+      <w:r>
+        <w:rPr>
+          <w:i/>
+          <w:iCs/>
+          <w:color w:val="475569"/>
+          <w:sz w:val="17"/>
+          <w:szCs w:val="17"/>
+        </w:rPr>
+        <w:t xml:space="preserve">Evidencia 05a. Regla "Temperatura alta" provisionada, en estado Normal.</w:t>
+      </w:r>
+    </w:p>
+    <w:p>
+      <w:pPr>
+        <w:keepNext/>
+        <w:spacing w:after="40" w:before="120"/>
+        <w:jc w:val="center"/>
+      </w:pPr>
+      <w:r>
+        <w:drawing>
+          <wp:inline distT="0" distB="0" distL="0" distR="0">
+            <wp:extent cx="5848350" cy="2724150"/>
+            <wp:effectExtent t="0" r="0" b="0" l="0"/>
+            <wp:docPr id="1" name="" descr="" title=""/>
+            <wp:cNvGraphicFramePr>
+              <a:graphicFrameLocks xmlns:a="http://schemas.openxmlformats.org/drawingml/2006/main" noChangeAspect="1"/>
+            </wp:cNvGraphicFramePr>
+            <a:graphic xmlns:a="http://schemas.openxmlformats.org/drawingml/2006/main">
+              <a:graphicData uri="http://schemas.openxmlformats.org/drawingml/2006/picture">
+                <pic:pic xmlns:pic="http://schemas.openxmlformats.org/drawingml/2006/picture">
+                  <pic:nvPicPr>
+                    <pic:cNvPr id="0" name="" descr=""/>
+                    <pic:cNvPicPr>
+                      <a:picLocks noChangeAspect="1" noChangeArrowheads="1"/>
+                    </pic:cNvPicPr>
+                  </pic:nvPicPr>
+                  <pic:blipFill>
+                    <a:blip r:embed="rId14" cstate="none"/>
+                    <a:srcRect/>
+                    <a:stretch>
+                      <a:fillRect/>
+                    </a:stretch>
+                  </pic:blipFill>
+                  <pic:spPr bwMode="auto">
+                    <a:xfrm>
+                      <a:off x="0" y="0"/>
+                      <a:ext cx="5848350" cy="2724150"/>
+                    </a:xfrm>
+                    <a:prstGeom prst="rect">
+                      <a:avLst/>
+                    </a:prstGeom>
+                  </pic:spPr>
+                </pic:pic>
+              </a:graphicData>
+            </a:graphic>
+          </wp:inline>
+        </w:drawing>
+      </w:r>
+    </w:p>
+    <w:p>
+      <w:pPr>
+        <w:spacing w:after="140"/>
+        <w:jc w:val="center"/>
+      </w:pPr>
+      <w:r>
+        <w:rPr>
+          <w:i/>
+          <w:iCs/>
+          <w:color w:val="475569"/>
+          <w:sz w:val="17"/>
+          <w:szCs w:val="17"/>
+        </w:rPr>
+        <w:t xml:space="preserve">Evidencia 05b. Tras forzar 45 °C: la regla pasa a Pending.</w:t>
+      </w:r>
+    </w:p>
+    <w:p>
+      <w:pPr>
+        <w:keepNext/>
+        <w:spacing w:after="40" w:before="120"/>
+        <w:jc w:val="center"/>
+      </w:pPr>
+      <w:r>
+        <w:drawing>
+          <wp:inline distT="0" distB="0" distL="0" distR="0">
+            <wp:extent cx="5848350" cy="2609850"/>
+            <wp:effectExtent t="0" r="0" b="0" l="0"/>
+            <wp:docPr id="1" name="" descr="" title=""/>
+            <wp:cNvGraphicFramePr>
+              <a:graphicFrameLocks xmlns:a="http://schemas.openxmlformats.org/drawingml/2006/main" noChangeAspect="1"/>
+            </wp:cNvGraphicFramePr>
+            <a:graphic xmlns:a="http://schemas.openxmlformats.org/drawingml/2006/main">
+              <a:graphicData uri="http://schemas.openxmlformats.org/drawingml/2006/picture">
+                <pic:pic xmlns:pic="http://schemas.openxmlformats.org/drawingml/2006/picture">
+                  <pic:nvPicPr>
+                    <pic:cNvPr id="0" name="" descr=""/>
+                    <pic:cNvPicPr>
+                      <a:picLocks noChangeAspect="1" noChangeArrowheads="1"/>
+                    </pic:cNvPicPr>
+                  </pic:nvPicPr>
+                  <pic:blipFill>
+                    <a:blip r:embed="rId15" cstate="none"/>
+                    <a:srcRect/>
+                    <a:stretch>
+                      <a:fillRect/>
+                    </a:stretch>
+                  </pic:blipFill>
+                  <pic:spPr bwMode="auto">
+                    <a:xfrm>
+                      <a:off x="0" y="0"/>
+                      <a:ext cx="5848350" cy="2609850"/>
+                    </a:xfrm>
+                    <a:prstGeom prst="rect">
+                      <a:avLst/>
+                    </a:prstGeom>
+                  </pic:spPr>
+                </pic:pic>
+              </a:graphicData>
+            </a:graphic>
+          </wp:inline>
+        </w:drawing>
+      </w:r>
+    </w:p>
+    <w:p>
+      <w:pPr>
+        <w:spacing w:after="140"/>
+        <w:jc w:val="center"/>
+      </w:pPr>
+      <w:r>
+        <w:rPr>
+          <w:i/>
+          <w:iCs/>
+          <w:color w:val="475569"/>
+          <w:sz w:val="17"/>
+          <w:szCs w:val="17"/>
+        </w:rPr>
+        <w:t xml:space="preserve">Evidencia 05. La regla pasa a Firing.</w:t>
+      </w:r>
+    </w:p>
+    <w:p>
+      <w:pPr>
+        <w:keepNext/>
+        <w:spacing w:after="40" w:before="120"/>
+        <w:jc w:val="center"/>
+      </w:pPr>
+      <w:r>
+        <w:drawing>
+          <wp:inline distT="0" distB="0" distL="0" distR="0">
+            <wp:extent cx="5848350" cy="828675"/>
+            <wp:effectExtent t="0" r="0" b="0" l="0"/>
+            <wp:docPr id="1" name="" descr="" title=""/>
+            <wp:cNvGraphicFramePr>
+              <a:graphicFrameLocks xmlns:a="http://schemas.openxmlformats.org/drawingml/2006/main" noChangeAspect="1"/>
+            </wp:cNvGraphicFramePr>
+            <a:graphic xmlns:a="http://schemas.openxmlformats.org/drawingml/2006/main">
+              <a:graphicData uri="http://schemas.openxmlformats.org/drawingml/2006/picture">
+                <pic:pic xmlns:pic="http://schemas.openxmlformats.org/drawingml/2006/picture">
+                  <pic:nvPicPr>
+                    <pic:cNvPr id="0" name="" descr=""/>
+                    <pic:cNvPicPr>
+                      <a:picLocks noChangeAspect="1" noChangeArrowheads="1"/>
+                    </pic:cNvPicPr>
+                  </pic:nvPicPr>
+                  <pic:blipFill>
+                    <a:blip r:embed="rId16" cstate="none"/>
+                    <a:srcRect/>
+                    <a:stretch>
+                      <a:fillRect/>
+                    </a:stretch>
+                  </pic:blipFill>
+                  <pic:spPr bwMode="auto">
+                    <a:xfrm>
+                      <a:off x="0" y="0"/>
+                      <a:ext cx="5848350" cy="828675"/>
+                    </a:xfrm>
+                    <a:prstGeom prst="rect">
+                      <a:avLst/>
+                    </a:prstGeom>
+                  </pic:spPr>
+                </pic:pic>
+              </a:graphicData>
+            </a:graphic>
+          </wp:inline>
+        </w:drawing>
+      </w:r>
+    </w:p>
+    <w:p>
+      <w:pPr>
+        <w:spacing w:after="140"/>
+        <w:jc w:val="center"/>
+      </w:pPr>
+      <w:r>
+        <w:rPr>
+          <w:i/>
+          <w:iCs/>
+          <w:color w:val="475569"/>
+          <w:sz w:val="17"/>
+          <w:szCs w:val="17"/>
+        </w:rPr>
+        <w:t xml:space="preserve">Evidencia 06. Log del webhook: FIRING (02:11:50 UTC, valor 45) y RESOLVED (02:15:50 UTC, valor 23,38).</w:t>
+      </w:r>
+    </w:p>
+    <w:p>
+      <w:pPr>
+        <w:keepNext/>
+        <w:spacing w:after="40" w:before="120"/>
+      </w:pPr>
+      <w:r>
+        <w:rPr>
+          <w:b/>
+          <w:bCs/>
+          <w:sz w:val="18"/>
+          <w:szCs w:val="18"/>
+        </w:rPr>
+        <w:t xml:space="preserve">Evidencia inicio_toma.txt</w:t>
+      </w:r>
+    </w:p>
+    <w:p>
+      <w:pPr>
+        <w:spacing w:after="0"/>
+      </w:pPr>
+      <w:r>
+        <w:rPr>
+          <w:rFonts w:ascii="Consolas" w:cs="Consolas" w:eastAsia="Consolas" w:hAnsi="Consolas"/>
+          <w:sz w:val="14"/>
+          <w:szCs w:val="14"/>
+        </w:rPr>
+        <w:t xml:space="preserve">Inicio de la toma: 2026-10-17 21:22:11 UTC</w:t>
+      </w:r>
+    </w:p>
+    <w:p>
+      <w:pPr>
+        <w:spacing w:after="0"/>
+      </w:pPr>
+      <w:r>
+        <w:rPr>
+          <w:rFonts w:ascii="Consolas" w:cs="Consolas" w:eastAsia="Consolas" w:hAnsi="Consolas"/>
+          <w:sz w:val="14"/>
+          <w:szCs w:val="14"/>
+        </w:rPr>
+        <w:t xml:space="preserve"> </w:t>
+      </w:r>
+    </w:p>
+    <w:p>
+      <w:pPr>
+        <w:keepNext/>
+        <w:spacing w:after="40" w:before="120"/>
+      </w:pPr>
+      <w:r>
+        <w:rPr>
+          <w:b/>
+          <w:bCs/>
+          <w:sz w:val="18"/>
+          <w:szCs w:val="18"/>
+        </w:rPr>
+        <w:t xml:space="preserve">Evidencia 07_resumen_ventana.txt (salida de scripts/resumen_ventana.sh)</w:t>
+      </w:r>
+    </w:p>
+    <w:p>
+      <w:pPr>
+        <w:spacing w:after="0"/>
+      </w:pPr>
+      <w:r>
+        <w:rPr>
+          <w:rFonts w:ascii="Consolas" w:cs="Consolas" w:eastAsia="Consolas" w:hAnsi="Consolas"/>
+          <w:sz w:val="14"/>
+          <w:szCs w:val="14"/>
+        </w:rPr>
+        <w:t xml:space="preserve">Ventana analizada: 2026-10-17T21:17:11Z -&gt; 2026-10-21T21:27:11Z (desde inicio_toma.txt: 2026-10-17 21:22:11 UTC, 4 dias)</w:t>
+      </w:r>
+    </w:p>
+    <w:p>
+      <w:pPr>
+        <w:spacing w:after="0"/>
+      </w:pPr>
+      <w:r>
+        <w:rPr>
+          <w:rFonts w:ascii="Consolas" w:cs="Consolas" w:eastAsia="Consolas" w:hAnsi="Consolas"/>
+          <w:sz w:val="14"/>
+          <w:szCs w:val="14"/>
+        </w:rPr>
+        <w:t xml:space="preserve"> </w:t>
+      </w:r>
+    </w:p>
+    <w:p>
+      <w:pPr>
+        <w:spacing w:after="0"/>
+      </w:pPr>
+      <w:r>
+        <w:rPr>
+          <w:rFonts w:ascii="Consolas" w:cs="Consolas" w:eastAsia="Consolas" w:hAnsi="Consolas"/>
+          <w:sz w:val="14"/>
+          <w:szCs w:val="14"/>
+        </w:rPr>
+        <w:t xml:space="preserve">== Primer punto (inicio de la toma) ==</w:t>
+      </w:r>
+    </w:p>
+    <w:p>
+      <w:pPr>
+        <w:spacing w:after="0"/>
+      </w:pPr>
+      <w:r>
+        <w:rPr>
+          <w:rFonts w:ascii="Consolas" w:cs="Consolas" w:eastAsia="Consolas" w:hAnsi="Consolas"/>
+          <w:sz w:val="14"/>
+          <w:szCs w:val="14"/>
+        </w:rPr>
+        <w:t xml:space="preserve">#group,false,false,false,false</w:t>
+      </w:r>
+    </w:p>
+    <w:p>
+      <w:pPr>
+        <w:spacing w:after="0"/>
+      </w:pPr>
+      <w:r>
+        <w:rPr>
+          <w:rFonts w:ascii="Consolas" w:cs="Consolas" w:eastAsia="Consolas" w:hAnsi="Consolas"/>
+          <w:sz w:val="14"/>
+          <w:szCs w:val="14"/>
+        </w:rPr>
+        <w:t xml:space="preserve">#datatype,string,long,dateTime:RFC3339,double</w:t>
+      </w:r>
+    </w:p>
+    <w:p>
+      <w:pPr>
+        <w:spacing w:after="0"/>
+      </w:pPr>
+      <w:r>
+        <w:rPr>
+          <w:rFonts w:ascii="Consolas" w:cs="Consolas" w:eastAsia="Consolas" w:hAnsi="Consolas"/>
+          <w:sz w:val="14"/>
+          <w:szCs w:val="14"/>
+        </w:rPr>
+        <w:t xml:space="preserve">#default,_result,,,</w:t>
+      </w:r>
+    </w:p>
+    <w:p>
+      <w:pPr>
+        <w:spacing w:after="0"/>
+      </w:pPr>
+      <w:r>
+        <w:rPr>
+          <w:rFonts w:ascii="Consolas" w:cs="Consolas" w:eastAsia="Consolas" w:hAnsi="Consolas"/>
+          <w:sz w:val="14"/>
+          <w:szCs w:val="14"/>
+        </w:rPr>
+        <w:t xml:space="preserve">,result,table,_time,_value</w:t>
+      </w:r>
+    </w:p>
+    <w:p>
+      <w:pPr>
+        <w:spacing w:after="0"/>
+      </w:pPr>
+      <w:r>
+        <w:rPr>
+          <w:rFonts w:ascii="Consolas" w:cs="Consolas" w:eastAsia="Consolas" w:hAnsi="Consolas"/>
+          <w:sz w:val="14"/>
+          <w:szCs w:val="14"/>
+        </w:rPr>
+        <w:t xml:space="preserve">,,0,2026-10-17T21:20:35.712Z,28.68</w:t>
+      </w:r>
+    </w:p>
+    <w:p>
+      <w:pPr>
+        <w:spacing w:after="0"/>
+      </w:pPr>
+      <w:r>
+        <w:rPr>
+          <w:rFonts w:ascii="Consolas" w:cs="Consolas" w:eastAsia="Consolas" w:hAnsi="Consolas"/>
+          <w:sz w:val="14"/>
+          <w:szCs w:val="14"/>
+        </w:rPr>
+        <w:t xml:space="preserve"> </w:t>
+      </w:r>
+    </w:p>
+    <w:p>
+      <w:pPr>
+        <w:spacing w:after="0"/>
+      </w:pPr>
+      <w:r>
+        <w:rPr>
+          <w:rFonts w:ascii="Consolas" w:cs="Consolas" w:eastAsia="Consolas" w:hAnsi="Consolas"/>
+          <w:sz w:val="14"/>
+          <w:szCs w:val="14"/>
+        </w:rPr>
+        <w:t xml:space="preserve"> </w:t>
+      </w:r>
+    </w:p>
+    <w:p>
+      <w:pPr>
+        <w:spacing w:after="0"/>
+      </w:pPr>
+      <w:r>
+        <w:rPr>
+          <w:rFonts w:ascii="Consolas" w:cs="Consolas" w:eastAsia="Consolas" w:hAnsi="Consolas"/>
+          <w:sz w:val="14"/>
+          <w:szCs w:val="14"/>
+        </w:rPr>
+        <w:t xml:space="preserve">== Ultimo punto ==</w:t>
+      </w:r>
+    </w:p>
+    <w:p>
+      <w:pPr>
+        <w:spacing w:after="0"/>
+      </w:pPr>
+      <w:r>
+        <w:rPr>
+          <w:rFonts w:ascii="Consolas" w:cs="Consolas" w:eastAsia="Consolas" w:hAnsi="Consolas"/>
+          <w:sz w:val="14"/>
+          <w:szCs w:val="14"/>
+        </w:rPr>
+        <w:t xml:space="preserve">#group,false,false,false,false</w:t>
+      </w:r>
+    </w:p>
+    <w:p>
+      <w:pPr>
+        <w:spacing w:after="0"/>
+      </w:pPr>
+      <w:r>
+        <w:rPr>
+          <w:rFonts w:ascii="Consolas" w:cs="Consolas" w:eastAsia="Consolas" w:hAnsi="Consolas"/>
+          <w:sz w:val="14"/>
+          <w:szCs w:val="14"/>
+        </w:rPr>
+        <w:t xml:space="preserve">#datatype,string,long,dateTime:RFC3339,double</w:t>
+      </w:r>
+    </w:p>
+    <w:p>
+      <w:pPr>
+        <w:spacing w:after="0"/>
+      </w:pPr>
+      <w:r>
+        <w:rPr>
+          <w:rFonts w:ascii="Consolas" w:cs="Consolas" w:eastAsia="Consolas" w:hAnsi="Consolas"/>
+          <w:sz w:val="14"/>
+          <w:szCs w:val="14"/>
+        </w:rPr>
+        <w:t xml:space="preserve">#default,_result,,,</w:t>
+      </w:r>
+    </w:p>
+    <w:p>
+      <w:pPr>
+        <w:spacing w:after="0"/>
+      </w:pPr>
+      <w:r>
+        <w:rPr>
+          <w:rFonts w:ascii="Consolas" w:cs="Consolas" w:eastAsia="Consolas" w:hAnsi="Consolas"/>
+          <w:sz w:val="14"/>
+          <w:szCs w:val="14"/>
+        </w:rPr>
+        <w:t xml:space="preserve">,result,table,_time,_value</w:t>
+      </w:r>
+    </w:p>
+    <w:p>
+      <w:pPr>
+        <w:spacing w:after="0"/>
+      </w:pPr>
+      <w:r>
+        <w:rPr>
+          <w:rFonts w:ascii="Consolas" w:cs="Consolas" w:eastAsia="Consolas" w:hAnsi="Consolas"/>
+          <w:sz w:val="14"/>
+          <w:szCs w:val="14"/>
+        </w:rPr>
+        <w:t xml:space="preserve">,,0,2026-10-21T21:27:05.712Z,29.51</w:t>
+      </w:r>
+    </w:p>
+    <w:p>
+      <w:pPr>
+        <w:spacing w:after="0"/>
+      </w:pPr>
+      <w:r>
+        <w:rPr>
+          <w:rFonts w:ascii="Consolas" w:cs="Consolas" w:eastAsia="Consolas" w:hAnsi="Consolas"/>
+          <w:sz w:val="14"/>
+          <w:szCs w:val="14"/>
+        </w:rPr>
+        <w:t xml:space="preserve"> </w:t>
+      </w:r>
+    </w:p>
+    <w:p>
+      <w:pPr>
+        <w:spacing w:after="0"/>
+      </w:pPr>
+      <w:r>
+        <w:rPr>
+          <w:rFonts w:ascii="Consolas" w:cs="Consolas" w:eastAsia="Consolas" w:hAnsi="Consolas"/>
+          <w:sz w:val="14"/>
+          <w:szCs w:val="14"/>
+        </w:rPr>
+        <w:t xml:space="preserve"> </w:t>
+      </w:r>
+    </w:p>
+    <w:p>
+      <w:pPr>
+        <w:spacing w:after="0"/>
+      </w:pPr>
+      <w:r>
+        <w:rPr>
+          <w:rFonts w:ascii="Consolas" w:cs="Consolas" w:eastAsia="Consolas" w:hAnsi="Consolas"/>
+          <w:sz w:val="14"/>
+          <w:szCs w:val="14"/>
+        </w:rPr>
+        <w:t xml:space="preserve">== Total de puntos de temperature (esperado ~360 por hora a 10 s) ==</w:t>
+      </w:r>
+    </w:p>
+    <w:p>
+      <w:pPr>
+        <w:spacing w:after="0"/>
+      </w:pPr>
+      <w:r>
+        <w:rPr>
+          <w:rFonts w:ascii="Consolas" w:cs="Consolas" w:eastAsia="Consolas" w:hAnsi="Consolas"/>
+          <w:sz w:val="14"/>
+          <w:szCs w:val="14"/>
+        </w:rPr>
+        <w:t xml:space="preserve">#group,false,false,false</w:t>
+      </w:r>
+    </w:p>
+    <w:p>
+      <w:pPr>
+        <w:spacing w:after="0"/>
+      </w:pPr>
+      <w:r>
+        <w:rPr>
+          <w:rFonts w:ascii="Consolas" w:cs="Consolas" w:eastAsia="Consolas" w:hAnsi="Consolas"/>
+          <w:sz w:val="14"/>
+          <w:szCs w:val="14"/>
+        </w:rPr>
+        <w:t xml:space="preserve">#datatype,string,long,long</w:t>
+      </w:r>
+    </w:p>
+    <w:p>
+      <w:pPr>
+        <w:spacing w:after="0"/>
+      </w:pPr>
+      <w:r>
+        <w:rPr>
+          <w:rFonts w:ascii="Consolas" w:cs="Consolas" w:eastAsia="Consolas" w:hAnsi="Consolas"/>
+          <w:sz w:val="14"/>
+          <w:szCs w:val="14"/>
+        </w:rPr>
+        <w:t xml:space="preserve">#default,_result,,</w:t>
+      </w:r>
+    </w:p>
+    <w:p>
+      <w:pPr>
+        <w:spacing w:after="0"/>
+      </w:pPr>
+      <w:r>
+        <w:rPr>
+          <w:rFonts w:ascii="Consolas" w:cs="Consolas" w:eastAsia="Consolas" w:hAnsi="Consolas"/>
+          <w:sz w:val="14"/>
+          <w:szCs w:val="14"/>
+        </w:rPr>
+        <w:t xml:space="preserve">,result,table,_value</w:t>
+      </w:r>
+    </w:p>
+    <w:p>
+      <w:pPr>
+        <w:spacing w:after="0"/>
+      </w:pPr>
+      <w:r>
+        <w:rPr>
+          <w:rFonts w:ascii="Consolas" w:cs="Consolas" w:eastAsia="Consolas" w:hAnsi="Consolas"/>
+          <w:sz w:val="14"/>
+          <w:szCs w:val="14"/>
+        </w:rPr>
+        <w:t xml:space="preserve">,,0,34600</w:t>
+      </w:r>
+    </w:p>
+    <w:p>
+      <w:pPr>
+        <w:spacing w:after="0"/>
+      </w:pPr>
+      <w:r>
+        <w:rPr>
+          <w:rFonts w:ascii="Consolas" w:cs="Consolas" w:eastAsia="Consolas" w:hAnsi="Consolas"/>
+          <w:sz w:val="14"/>
+          <w:szCs w:val="14"/>
+        </w:rPr>
+        <w:t xml:space="preserve"> </w:t>
+      </w:r>
+    </w:p>
+    <w:p>
+      <w:pPr>
+        <w:spacing w:after="0"/>
+      </w:pPr>
+      <w:r>
+        <w:rPr>
+          <w:rFonts w:ascii="Consolas" w:cs="Consolas" w:eastAsia="Consolas" w:hAnsi="Consolas"/>
+          <w:sz w:val="14"/>
+          <w:szCs w:val="14"/>
+        </w:rPr>
+        <w:t xml:space="preserve"> </w:t>
+      </w:r>
+    </w:p>
+    <w:p>
+      <w:pPr>
+        <w:spacing w:after="0"/>
+      </w:pPr>
+      <w:r>
+        <w:rPr>
+          <w:rFonts w:ascii="Consolas" w:cs="Consolas" w:eastAsia="Consolas" w:hAnsi="Consolas"/>
+          <w:sz w:val="14"/>
+          <w:szCs w:val="14"/>
+        </w:rPr>
+        <w:t xml:space="preserve">== Horas con menos de 300 mensajes (la primera y la ultima hora son parciales y es normal que salgan) ==</w:t>
+      </w:r>
+    </w:p>
+    <w:p>
+      <w:pPr>
+        <w:spacing w:after="0"/>
+      </w:pPr>
+      <w:r>
+        <w:rPr>
+          <w:rFonts w:ascii="Consolas" w:cs="Consolas" w:eastAsia="Consolas" w:hAnsi="Consolas"/>
+          <w:sz w:val="14"/>
+          <w:szCs w:val="14"/>
+        </w:rPr>
+        <w:t xml:space="preserve">#group,false,false,false,false</w:t>
+      </w:r>
+    </w:p>
+    <w:p>
+      <w:pPr>
+        <w:spacing w:after="0"/>
+      </w:pPr>
+      <w:r>
+        <w:rPr>
+          <w:rFonts w:ascii="Consolas" w:cs="Consolas" w:eastAsia="Consolas" w:hAnsi="Consolas"/>
+          <w:sz w:val="14"/>
+          <w:szCs w:val="14"/>
+        </w:rPr>
+        <w:t xml:space="preserve">#datatype,string,long,dateTime:RFC3339,long</w:t>
+      </w:r>
+    </w:p>
+    <w:p>
+      <w:pPr>
+        <w:spacing w:after="0"/>
+      </w:pPr>
+      <w:r>
+        <w:rPr>
+          <w:rFonts w:ascii="Consolas" w:cs="Consolas" w:eastAsia="Consolas" w:hAnsi="Consolas"/>
+          <w:sz w:val="14"/>
+          <w:szCs w:val="14"/>
+        </w:rPr>
+        <w:t xml:space="preserve">#default,_result,,,</w:t>
+      </w:r>
+    </w:p>
+    <w:p>
+      <w:pPr>
+        <w:spacing w:after="0"/>
+      </w:pPr>
+      <w:r>
+        <w:rPr>
+          <w:rFonts w:ascii="Consolas" w:cs="Consolas" w:eastAsia="Consolas" w:hAnsi="Consolas"/>
+          <w:sz w:val="14"/>
+          <w:szCs w:val="14"/>
+        </w:rPr>
+        <w:t xml:space="preserve">,result,table,_time,_value</w:t>
+      </w:r>
+    </w:p>
+    <w:p>
+      <w:pPr>
+        <w:spacing w:after="0"/>
+      </w:pPr>
+      <w:r>
+        <w:rPr>
+          <w:rFonts w:ascii="Consolas" w:cs="Consolas" w:eastAsia="Consolas" w:hAnsi="Consolas"/>
+          <w:sz w:val="14"/>
+          <w:szCs w:val="14"/>
+        </w:rPr>
+        <w:t xml:space="preserve">,,0,2026-10-17T22:00:00Z,237</w:t>
+      </w:r>
+    </w:p>
+    <w:p>
+      <w:pPr>
+        <w:spacing w:after="0"/>
+      </w:pPr>
+      <w:r>
+        <w:rPr>
+          <w:rFonts w:ascii="Consolas" w:cs="Consolas" w:eastAsia="Consolas" w:hAnsi="Consolas"/>
+          <w:sz w:val="14"/>
+          <w:szCs w:val="14"/>
+        </w:rPr>
+        <w:t xml:space="preserve">,,0,2026-10-21T21:27:11Z,163</w:t>
+      </w:r>
+    </w:p>
+    <w:p>
+      <w:pPr>
+        <w:spacing w:after="0"/>
+      </w:pPr>
+      <w:r>
+        <w:rPr>
+          <w:rFonts w:ascii="Consolas" w:cs="Consolas" w:eastAsia="Consolas" w:hAnsi="Consolas"/>
+          <w:sz w:val="14"/>
+          <w:szCs w:val="14"/>
+        </w:rPr>
+        <w:t xml:space="preserve"> </w:t>
+      </w:r>
+    </w:p>
+    <w:p>
+      <w:pPr>
+        <w:spacing w:after="0"/>
+      </w:pPr>
+      <w:r>
+        <w:rPr>
+          <w:rFonts w:ascii="Consolas" w:cs="Consolas" w:eastAsia="Consolas" w:hAnsi="Consolas"/>
+          <w:sz w:val="14"/>
+          <w:szCs w:val="14"/>
+        </w:rPr>
+        <w:t xml:space="preserve"> </w:t>
       </w:r>
     </w:p>
     <w:sectPr>

</xml_diff>